<commit_message>
Add second table-style band, border theme colors, content control locks and checkbox glyphs
Four small, mechanical extensions to features already in place:
- TableStyleDefinition gains BandedRow2/BandedColumn2 (the even band of each banding
  axis), completing all thirteen OOXML conditional-formatting regions.
- BorderSide.Color now round-trips a full Theme value (kind/tint/shade) instead of just
  the fallback RGB - fixed once in StyleRegistry.fs's shared border-side helpers, so it
  covers paragraph, table, cell, and table-style-definition borders at once.
- ContentControlProps gains Lock (w:lock: sdtLocked/contentLocked/sdtContentLocked).
- CheckBoxControl gains optional custom checked/unchecked glyphs (w14:checkedState/
  uncheckedState).

Theme colors in w:highlight were scoped out - OOXML's HighlightColorValues is a fixed
16-color palette with no theme-color concept at all, confirmed via reflection.

Co-Authored-By: Claude Sonnet 5 <noreply@anthropic.com>
</commit_message>
<xml_diff>
--- a/tests/Kookerella.FsWordDsl.Tests/Examples/ContentControls/output.docx
+++ b/tests/Kookerella.FsWordDsl.Tests/Examples/ContentControls/output.docx
@@ -69,6 +69,7 @@
       <w:sdt>
         <w:sdtPr>
           <w:alias w:val="Meeting Date"/>
+          <w:lock w:val="contentLocked"/>
           <w:date w:fullDate="2024-03-01T00:00:00">
             <w:dateFormat w:val="MMMM d, yyyy"/>
           </w:date>
@@ -87,8 +88,11 @@
       <w:sdt>
         <w:sdtPr>
           <w:tag w:val="agreed"/>
+          <w:lock w:val="sdtContentLocked"/>
           <w14:checkbox xmlns:w14="http://schemas.microsoft.com/office/word/2010/wordml">
             <w14:checked w14:val="1"/>
+            <w14:checkedState w14:font="Wingdings" w14:val="2612"/>
+            <w14:uncheckedState w14:font="Wingdings" w14:val="2610"/>
           </w14:checkbox>
         </w:sdtPr>
         <w:sdtContent>

</xml_diff>